<commit_message>
Add real Ovid execution results for Health Selection and Fundamental Causes searches
</commit_message>
<xml_diff>
--- a/Estrategias_de_Busca_Ovid.docx
+++ b/Estrategias_de_Busca_Ovid.docx
@@ -385,11 +385,11 @@
     </w:p>
     <w:p>
       <w:pPr>
-        <w:pStyle w:val="Heading2"/>
-        <w:spacing w:after="150" w:before="300"/>
-      </w:pPr>
-      <w:r>
-        <w:t xml:space="preserve">1.4 Estratégia B — Ampla (Theoretical Basis / Framework / Perspective)</w:t>
+        <w:pStyle w:val="Heading3"/>
+        <w:spacing w:after="100" w:before="200"/>
+      </w:pPr>
+      <w:r>
+        <w:t xml:space="preserve">Resultados da execução real no Ovid</w:t>
       </w:r>
     </w:p>
     <w:p>
@@ -410,117 +410,150 @@
           <w:sz w:val="20"/>
           <w:szCs w:val="20"/>
         </w:rPr>
-        <w:t xml:space="preserve">15. social causation.mp,ti,ab.</w:t>
-      </w:r>
-      <w:r>
-        <w:br/>
-      </w:r>
-      <w:r>
-        <w:rPr>
-          <w:rFonts w:ascii="Courier New" w:cs="Courier New" w:eastAsia="Courier New" w:hAnsi="Courier New"/>
-          <w:sz w:val="20"/>
-          <w:szCs w:val="20"/>
-        </w:rPr>
-        <w:t xml:space="preserve">16. fundamental cause*.mp,ti,ab.</w:t>
-      </w:r>
-      <w:r>
-        <w:br/>
-      </w:r>
-      <w:r>
-        <w:rPr>
-          <w:rFonts w:ascii="Courier New" w:cs="Courier New" w:eastAsia="Courier New" w:hAnsi="Courier New"/>
-          <w:sz w:val="20"/>
-          <w:szCs w:val="20"/>
-        </w:rPr>
-        <w:t xml:space="preserve">17. exp Socioeconomic Factors/</w:t>
-      </w:r>
-      <w:r>
-        <w:br/>
-      </w:r>
-      <w:r>
-        <w:rPr>
-          <w:rFonts w:ascii="Courier New" w:cs="Courier New" w:eastAsia="Courier New" w:hAnsi="Courier New"/>
-          <w:sz w:val="20"/>
-          <w:szCs w:val="20"/>
-        </w:rPr>
-        <w:t xml:space="preserve">18. (socioeconomic adj3 (status or position or gradient)).mp,ti,ab.</w:t>
-      </w:r>
-      <w:r>
-        <w:br/>
-      </w:r>
-      <w:r>
-        <w:rPr>
-          <w:rFonts w:ascii="Courier New" w:cs="Courier New" w:eastAsia="Courier New" w:hAnsi="Courier New"/>
-          <w:sz w:val="20"/>
-          <w:szCs w:val="20"/>
-        </w:rPr>
-        <w:t xml:space="preserve">19. exp Social Class/</w:t>
-      </w:r>
-      <w:r>
-        <w:br/>
-      </w:r>
-      <w:r>
-        <w:rPr>
-          <w:rFonts w:ascii="Courier New" w:cs="Courier New" w:eastAsia="Courier New" w:hAnsi="Courier New"/>
-          <w:sz w:val="20"/>
-          <w:szCs w:val="20"/>
-        </w:rPr>
-        <w:t xml:space="preserve">20. or/15-19</w:t>
-      </w:r>
-      <w:r>
-        <w:br/>
-      </w:r>
-      <w:r>
-        <w:rPr>
-          <w:rFonts w:ascii="Courier New" w:cs="Courier New" w:eastAsia="Courier New" w:hAnsi="Courier New"/>
-          <w:sz w:val="20"/>
-          <w:szCs w:val="20"/>
-        </w:rPr>
-        <w:t xml:space="preserve">21. exp Social Mobility/</w:t>
-      </w:r>
-      <w:r>
-        <w:br/>
-      </w:r>
-      <w:r>
-        <w:rPr>
-          <w:rFonts w:ascii="Courier New" w:cs="Courier New" w:eastAsia="Courier New" w:hAnsi="Courier New"/>
-          <w:sz w:val="20"/>
-          <w:szCs w:val="20"/>
-        </w:rPr>
-        <w:t xml:space="preserve">22. (social or intergenerational or occupational) adj3 mobilit*.mp,ti,ab.</w:t>
-      </w:r>
-      <w:r>
-        <w:br/>
-      </w:r>
-      <w:r>
-        <w:rPr>
-          <w:rFonts w:ascii="Courier New" w:cs="Courier New" w:eastAsia="Courier New" w:hAnsi="Courier New"/>
-          <w:sz w:val="20"/>
-          <w:szCs w:val="20"/>
-        </w:rPr>
-        <w:t xml:space="preserve">23. 21 or 22</w:t>
-      </w:r>
-      <w:r>
-        <w:br/>
-      </w:r>
-      <w:r>
-        <w:rPr>
-          <w:rFonts w:ascii="Courier New" w:cs="Courier New" w:eastAsia="Courier New" w:hAnsi="Courier New"/>
-          <w:sz w:val="20"/>
-          <w:szCs w:val="20"/>
-        </w:rPr>
-        <w:t xml:space="preserve">24. 6 or 20 or 23</w:t>
-      </w:r>
-      <w:r>
-        <w:br/>
-      </w:r>
-      <w:r>
-        <w:rPr>
-          <w:rFonts w:ascii="Courier New" w:cs="Courier New" w:eastAsia="Courier New" w:hAnsi="Courier New"/>
-          <w:sz w:val="20"/>
-          <w:szCs w:val="20"/>
-        </w:rPr>
-        <w:t xml:space="preserve">25. limit 24 to yr="1990-Current"</w:t>
+        <w:t xml:space="preserve">1.  health selection.mp,ti,ab.                                              295</w:t>
+      </w:r>
+      <w:r>
+        <w:br/>
+      </w:r>
+      <w:r>
+        <w:rPr>
+          <w:rFonts w:ascii="Courier New" w:cs="Courier New" w:eastAsia="Courier New" w:hAnsi="Courier New"/>
+          <w:sz w:val="20"/>
+          <w:szCs w:val="20"/>
+        </w:rPr>
+        <w:t xml:space="preserve">2.  reverse causation.mp,ti,ab.                                            1856</w:t>
+      </w:r>
+      <w:r>
+        <w:br/>
+      </w:r>
+      <w:r>
+        <w:rPr>
+          <w:rFonts w:ascii="Courier New" w:cs="Courier New" w:eastAsia="Courier New" w:hAnsi="Courier New"/>
+          <w:sz w:val="20"/>
+          <w:szCs w:val="20"/>
+        </w:rPr>
+        <w:t xml:space="preserve">3.  (health adj3 select*).mp,ti,ab.                                       11806</w:t>
+      </w:r>
+      <w:r>
+        <w:br/>
+      </w:r>
+      <w:r>
+        <w:rPr>
+          <w:rFonts w:ascii="Courier New" w:cs="Courier New" w:eastAsia="Courier New" w:hAnsi="Courier New"/>
+          <w:sz w:val="20"/>
+          <w:szCs w:val="20"/>
+        </w:rPr>
+        <w:t xml:space="preserve">4.  ((health-selective or health-related) adj3 mobilit*).mp,ti,ab.          158</w:t>
+      </w:r>
+      <w:r>
+        <w:br/>
+      </w:r>
+      <w:r>
+        <w:rPr>
+          <w:rFonts w:ascii="Courier New" w:cs="Courier New" w:eastAsia="Courier New" w:hAnsi="Courier New"/>
+          <w:sz w:val="20"/>
+          <w:szCs w:val="20"/>
+        </w:rPr>
+        <w:t xml:space="preserve">5.  indirect selection hypothesis.mp,ti,ab.                                   6</w:t>
+      </w:r>
+      <w:r>
+        <w:br/>
+      </w:r>
+      <w:r>
+        <w:rPr>
+          <w:rFonts w:ascii="Courier New" w:cs="Courier New" w:eastAsia="Courier New" w:hAnsi="Courier New"/>
+          <w:sz w:val="20"/>
+          <w:szCs w:val="20"/>
+        </w:rPr>
+        <w:t xml:space="preserve">6.  or/1-5                                                                13812</w:t>
+      </w:r>
+      <w:r>
+        <w:br/>
+      </w:r>
+      <w:r>
+        <w:rPr>
+          <w:rFonts w:ascii="Courier New" w:cs="Courier New" w:eastAsia="Courier New" w:hAnsi="Courier New"/>
+          <w:sz w:val="20"/>
+          <w:szCs w:val="20"/>
+        </w:rPr>
+        <w:t xml:space="preserve">7.  exp Health Status/                                                   556024</w:t>
+      </w:r>
+      <w:r>
+        <w:br/>
+      </w:r>
+      <w:r>
+        <w:rPr>
+          <w:rFonts w:ascii="Courier New" w:cs="Courier New" w:eastAsia="Courier New" w:hAnsi="Courier New"/>
+          <w:sz w:val="20"/>
+          <w:szCs w:val="20"/>
+        </w:rPr>
+        <w:t xml:space="preserve">8.  exp Morbidity/ or exp Mortality/                                    1151482</w:t>
+      </w:r>
+      <w:r>
+        <w:br/>
+      </w:r>
+      <w:r>
+        <w:rPr>
+          <w:rFonts w:ascii="Courier New" w:cs="Courier New" w:eastAsia="Courier New" w:hAnsi="Courier New"/>
+          <w:sz w:val="20"/>
+          <w:szCs w:val="20"/>
+        </w:rPr>
+        <w:t xml:space="preserve">9.  self rated health.mp,ti,ab.                                           11898</w:t>
+      </w:r>
+      <w:r>
+        <w:br/>
+      </w:r>
+      <w:r>
+        <w:rPr>
+          <w:rFonts w:ascii="Courier New" w:cs="Courier New" w:eastAsia="Courier New" w:hAnsi="Courier New"/>
+          <w:sz w:val="20"/>
+          <w:szCs w:val="20"/>
+        </w:rPr>
+        <w:t xml:space="preserve">10. or/7-9                                                              1663422</w:t>
+      </w:r>
+      <w:r>
+        <w:br/>
+      </w:r>
+      <w:r>
+        <w:rPr>
+          <w:rFonts w:ascii="Courier New" w:cs="Courier New" w:eastAsia="Courier New" w:hAnsi="Courier New"/>
+          <w:sz w:val="20"/>
+          <w:szCs w:val="20"/>
+        </w:rPr>
+        <w:t xml:space="preserve">11. 6 and 10                                                               2746</w:t>
+      </w:r>
+      <w:r>
+        <w:br/>
+      </w:r>
+      <w:r>
+        <w:rPr>
+          <w:rFonts w:ascii="Courier New" w:cs="Courier New" w:eastAsia="Courier New" w:hAnsi="Courier New"/>
+          <w:sz w:val="20"/>
+          <w:szCs w:val="20"/>
+        </w:rPr>
+        <w:t xml:space="preserve">12. (cross-lagged or ... or genotyp* or polygenic).mp,ti,ab.             658364</w:t>
+      </w:r>
+      <w:r>
+        <w:br/>
+      </w:r>
+      <w:r>
+        <w:rPr>
+          <w:rFonts w:ascii="Courier New" w:cs="Courier New" w:eastAsia="Courier New" w:hAnsi="Courier New"/>
+          <w:sz w:val="20"/>
+          <w:szCs w:val="20"/>
+        </w:rPr>
+        <w:t xml:space="preserve">13. 11 and 12                                                                86</w:t>
+      </w:r>
+      <w:r>
+        <w:br/>
+      </w:r>
+      <w:r>
+        <w:rPr>
+          <w:rFonts w:ascii="Courier New" w:cs="Courier New" w:eastAsia="Courier New" w:hAnsi="Courier New"/>
+          <w:sz w:val="20"/>
+          <w:szCs w:val="20"/>
+        </w:rPr>
+        <w:t xml:space="preserve">14. limit 13 to yr="1990-Current"                                          86</w:t>
       </w:r>
     </w:p>
     <w:p>
@@ -529,12 +562,12 @@
       </w:pPr>
       <w:r>
         <w:rPr>
-          <w:i/>
-          <w:iCs/>
-          <w:sz w:val="20"/>
-          <w:szCs w:val="20"/>
-        </w:rPr>
-        <w:t xml:space="preserve">A linha 25 roda sem cruzar com desfecho de saúde, para capturar artigos teóricos/framework — exige triagem manual mais pesada, mas evita perder literatura conceitual sem menção a desfecho específico.</w:t>
+          <w:b/>
+          <w:bCs/>
+          <w:sz w:val="20"/>
+          <w:szCs w:val="20"/>
+        </w:rPr>
+        <w:t xml:space="preserve">Decisão: mantidos os 86 resultados da linha 14 como conjunto final de Health Selection.</w:t>
       </w:r>
     </w:p>
     <w:p>
@@ -543,194 +576,7 @@
         <w:spacing w:after="150" w:before="300"/>
       </w:pPr>
       <w:r>
-        <w:t xml:space="preserve">1.5 Checklist de processo</w:t>
-      </w:r>
-    </w:p>
-    <w:p>
-      <w:pPr>
-        <w:pStyle w:val="ListParagraph"/>
-        <w:numPr>
-          <w:ilvl w:val="0"/>
-          <w:numId w:val="1"/>
-        </w:numPr>
-        <w:spacing w:after="80"/>
-      </w:pPr>
-      <w:r>
-        <w:t xml:space="preserve">Rodar nas 3 bases combinadas via Ovid (Medline + Embase + PsycINFO).</w:t>
-      </w:r>
-    </w:p>
-    <w:p>
-      <w:pPr>
-        <w:pStyle w:val="ListParagraph"/>
-        <w:numPr>
-          <w:ilvl w:val="0"/>
-          <w:numId w:val="1"/>
-        </w:numPr>
-        <w:spacing w:after="80"/>
-      </w:pPr>
-      <w:r>
-        <w:t xml:space="preserve">Aplicar Remove Duplicates antes de exportar.</w:t>
-      </w:r>
-    </w:p>
-    <w:p>
-      <w:pPr>
-        <w:pStyle w:val="ListParagraph"/>
-        <w:numPr>
-          <w:ilvl w:val="0"/>
-          <w:numId w:val="1"/>
-        </w:numPr>
-        <w:spacing w:after="80"/>
-      </w:pPr>
-      <w:r>
-        <w:t xml:space="preserve">Exportar Estratégia A e B separadamente, já rotulando por categoria (facilita a triagem com Downs &amp; Black depois).</w:t>
-      </w:r>
-    </w:p>
-    <w:p>
-      <w:pPr>
-        <w:pStyle w:val="ListParagraph"/>
-        <w:numPr>
-          <w:ilvl w:val="0"/>
-          <w:numId w:val="1"/>
-        </w:numPr>
-        <w:spacing w:after="80"/>
-      </w:pPr>
-      <w:r>
-        <w:t xml:space="preserve">Configurar Auto-Alert para ambas as estratégias.</w:t>
-      </w:r>
-    </w:p>
-    <w:p>
-      <w:pPr>
-        <w:pStyle w:val="Heading1"/>
-        <w:spacing w:after="200" w:before="400"/>
-      </w:pPr>
-      <w:r>
-        <w:t xml:space="preserve">2. Estratégia de Busca — Fundamental Causes</w:t>
-      </w:r>
-    </w:p>
-    <w:p>
-      <w:pPr>
-        <w:pStyle w:val="Heading2"/>
-        <w:spacing w:after="150" w:before="300"/>
-      </w:pPr>
-      <w:r>
-        <w:t xml:space="preserve">2.1 Conceitos-chave (nota da epidemiologista social)</w:t>
-      </w:r>
-    </w:p>
-    <w:p>
-      <w:pPr>
-        <w:spacing w:after="150"/>
-      </w:pPr>
-      <w:r>
-        <w:t xml:space="preserve">A teoria de Link &amp; Phelan (1995) não é sinônimo de "SES causa saúde" genérico. O que a diferencia: (1) recursos flexíveis — dinheiro, conhecimento, poder, prestígio, conexões sociais; (2) a associação persiste através de múltiplos mecanismos e múltiplas doenças; (3) a associação se reproduz quando surgem novos meios de evitar risco ("innovação"), frequentemente ampliando desigualdades em vez de reduzi-las.</w:t>
-      </w:r>
-    </w:p>
-    <w:p>
-      <w:pPr>
-        <w:pStyle w:val="ListParagraph"/>
-        <w:numPr>
-          <w:ilvl w:val="0"/>
-          <w:numId w:val="1"/>
-        </w:numPr>
-        <w:spacing w:after="80"/>
-      </w:pPr>
-      <w:r>
-        <w:t xml:space="preserve">Termos centrais: fundamental cause(s), flexible resources, beneficial social connections.</w:t>
-      </w:r>
-    </w:p>
-    <w:p>
-      <w:pPr>
-        <w:pStyle w:val="ListParagraph"/>
-        <w:numPr>
-          <w:ilvl w:val="0"/>
-          <w:numId w:val="1"/>
-        </w:numPr>
-        <w:spacing w:after="80"/>
-      </w:pPr>
-      <w:r>
-        <w:t xml:space="preserve">Elementos de teste empírico da teoria: diffusion of innovation, know-your-risk, disparidades que aumentam com novas tecnologias/intervenções.</w:t>
-      </w:r>
-    </w:p>
-    <w:p>
-      <w:pPr>
-        <w:pStyle w:val="Heading2"/>
-        <w:spacing w:after="150" w:before="300"/>
-      </w:pPr>
-      <w:r>
-        <w:t xml:space="preserve">2.2 Comentários da bibliotecária (sintaxe Ovid)</w:t>
-      </w:r>
-    </w:p>
-    <w:p>
-      <w:pPr>
-        <w:pStyle w:val="ListParagraph"/>
-        <w:numPr>
-          <w:ilvl w:val="0"/>
-          <w:numId w:val="1"/>
-        </w:numPr>
-        <w:spacing w:after="80"/>
-      </w:pPr>
-      <w:r>
-        <w:t xml:space="preserve">Remover o cruzamento direto com exp Socioeconomic Factors/ — sozinho, esse MeSH cruzado com desfecho de saúde é redundante com a Estratégia B de Social Causation/Health Selection, gerando duplicação massiva de resultados já triados.</w:t>
-      </w:r>
-    </w:p>
-    <w:p>
-      <w:pPr>
-        <w:pStyle w:val="ListParagraph"/>
-        <w:numPr>
-          <w:ilvl w:val="0"/>
-          <w:numId w:val="1"/>
-        </w:numPr>
-        <w:spacing w:after="80"/>
-      </w:pPr>
-      <w:r>
-        <w:t xml:space="preserve">"Fundamental causes" é um conceito rastreável a um artigo seminal (Link &amp; Phelan, 1995) e sua revisão de 2010 (Phelan, Link &amp; Tehranifar) — ideal para busca por citação (cited reference search), que o Ovid não faz bem.</w:t>
-      </w:r>
-    </w:p>
-    <w:p>
-      <w:pPr>
-        <w:pStyle w:val="ListParagraph"/>
-        <w:numPr>
-          <w:ilvl w:val="0"/>
-          <w:numId w:val="1"/>
-        </w:numPr>
-        <w:spacing w:after="80"/>
-      </w:pPr>
-      <w:r>
-        <w:t xml:space="preserve">Complementar fora do Ovid: rodar "cited by" no Web of Science ou Google Scholar para os dois artigos-âncora, e cruzar manualmente com os resultados do Ovid.</w:t>
-      </w:r>
-    </w:p>
-    <w:p>
-      <w:pPr>
-        <w:pStyle w:val="ListParagraph"/>
-        <w:numPr>
-          <w:ilvl w:val="0"/>
-          <w:numId w:val="1"/>
-        </w:numPr>
-        <w:spacing w:after="80"/>
-      </w:pPr>
-      <w:r>
-        <w:t xml:space="preserve">Usar aspas para frases compostas exatas (ex.: "beneficial social connections") para evitar ruído de adjacência solta.</w:t>
-      </w:r>
-    </w:p>
-    <w:p>
-      <w:pPr>
-        <w:pStyle w:val="ListParagraph"/>
-        <w:numPr>
-          <w:ilvl w:val="0"/>
-          <w:numId w:val="1"/>
-        </w:numPr>
-        <w:spacing w:after="80"/>
-      </w:pPr>
-      <w:r>
-        <w:t xml:space="preserve">Sem limite de idioma, mantendo consistência com a estratégia anterior.</w:t>
-      </w:r>
-    </w:p>
-    <w:p>
-      <w:pPr>
-        <w:pStyle w:val="Heading2"/>
-        <w:spacing w:after="150" w:before="300"/>
-      </w:pPr>
-      <w:r>
-        <w:t xml:space="preserve">2.3 Estratégia revisada (Ovid)</w:t>
+        <w:t xml:space="preserve">1.4 Estratégia B — Ampla (Theoretical Basis / Framework / Perspective) — descartada</w:t>
       </w:r>
     </w:p>
     <w:p>
@@ -751,6 +597,446 @@
           <w:sz w:val="20"/>
           <w:szCs w:val="20"/>
         </w:rPr>
+        <w:t xml:space="preserve">15. social causation.mp,ti,ab.</w:t>
+      </w:r>
+      <w:r>
+        <w:br/>
+      </w:r>
+      <w:r>
+        <w:rPr>
+          <w:rFonts w:ascii="Courier New" w:cs="Courier New" w:eastAsia="Courier New" w:hAnsi="Courier New"/>
+          <w:sz w:val="20"/>
+          <w:szCs w:val="20"/>
+        </w:rPr>
+        <w:t xml:space="preserve">16. fundamental cause*.mp,ti,ab.</w:t>
+      </w:r>
+      <w:r>
+        <w:br/>
+      </w:r>
+      <w:r>
+        <w:rPr>
+          <w:rFonts w:ascii="Courier New" w:cs="Courier New" w:eastAsia="Courier New" w:hAnsi="Courier New"/>
+          <w:sz w:val="20"/>
+          <w:szCs w:val="20"/>
+        </w:rPr>
+        <w:t xml:space="preserve">17. exp Socioeconomic Factors/</w:t>
+      </w:r>
+      <w:r>
+        <w:br/>
+      </w:r>
+      <w:r>
+        <w:rPr>
+          <w:rFonts w:ascii="Courier New" w:cs="Courier New" w:eastAsia="Courier New" w:hAnsi="Courier New"/>
+          <w:sz w:val="20"/>
+          <w:szCs w:val="20"/>
+        </w:rPr>
+        <w:t xml:space="preserve">18. (socioeconomic adj3 (status or position or gradient)).mp,ti,ab.</w:t>
+      </w:r>
+      <w:r>
+        <w:br/>
+      </w:r>
+      <w:r>
+        <w:rPr>
+          <w:rFonts w:ascii="Courier New" w:cs="Courier New" w:eastAsia="Courier New" w:hAnsi="Courier New"/>
+          <w:sz w:val="20"/>
+          <w:szCs w:val="20"/>
+        </w:rPr>
+        <w:t xml:space="preserve">19. exp Social Class/</w:t>
+      </w:r>
+      <w:r>
+        <w:br/>
+      </w:r>
+      <w:r>
+        <w:rPr>
+          <w:rFonts w:ascii="Courier New" w:cs="Courier New" w:eastAsia="Courier New" w:hAnsi="Courier New"/>
+          <w:sz w:val="20"/>
+          <w:szCs w:val="20"/>
+        </w:rPr>
+        <w:t xml:space="preserve">20. or/15-19</w:t>
+      </w:r>
+      <w:r>
+        <w:br/>
+      </w:r>
+      <w:r>
+        <w:rPr>
+          <w:rFonts w:ascii="Courier New" w:cs="Courier New" w:eastAsia="Courier New" w:hAnsi="Courier New"/>
+          <w:sz w:val="20"/>
+          <w:szCs w:val="20"/>
+        </w:rPr>
+        <w:t xml:space="preserve">21. exp Social Mobility/</w:t>
+      </w:r>
+      <w:r>
+        <w:br/>
+      </w:r>
+      <w:r>
+        <w:rPr>
+          <w:rFonts w:ascii="Courier New" w:cs="Courier New" w:eastAsia="Courier New" w:hAnsi="Courier New"/>
+          <w:sz w:val="20"/>
+          <w:szCs w:val="20"/>
+        </w:rPr>
+        <w:t xml:space="preserve">22. (social or intergenerational or occupational) adj3 mobilit*.mp,ti,ab.</w:t>
+      </w:r>
+      <w:r>
+        <w:br/>
+      </w:r>
+      <w:r>
+        <w:rPr>
+          <w:rFonts w:ascii="Courier New" w:cs="Courier New" w:eastAsia="Courier New" w:hAnsi="Courier New"/>
+          <w:sz w:val="20"/>
+          <w:szCs w:val="20"/>
+        </w:rPr>
+        <w:t xml:space="preserve">23. 21 or 22</w:t>
+      </w:r>
+      <w:r>
+        <w:br/>
+      </w:r>
+      <w:r>
+        <w:rPr>
+          <w:rFonts w:ascii="Courier New" w:cs="Courier New" w:eastAsia="Courier New" w:hAnsi="Courier New"/>
+          <w:sz w:val="20"/>
+          <w:szCs w:val="20"/>
+        </w:rPr>
+        <w:t xml:space="preserve">24. 6 or 20 or 23</w:t>
+      </w:r>
+      <w:r>
+        <w:br/>
+      </w:r>
+      <w:r>
+        <w:rPr>
+          <w:rFonts w:ascii="Courier New" w:cs="Courier New" w:eastAsia="Courier New" w:hAnsi="Courier New"/>
+          <w:sz w:val="20"/>
+          <w:szCs w:val="20"/>
+        </w:rPr>
+        <w:t xml:space="preserve">25. limit 24 to yr="1990-Current"</w:t>
+      </w:r>
+    </w:p>
+    <w:p>
+      <w:pPr>
+        <w:spacing w:after="150"/>
+      </w:pPr>
+      <w:r>
+        <w:rPr>
+          <w:i/>
+          <w:iCs/>
+          <w:sz w:val="20"/>
+          <w:szCs w:val="20"/>
+        </w:rPr>
+        <w:t xml:space="preserve">A linha 25 roda sem cruzar com desfecho de saúde, para capturar artigos teóricos/framework — exige triagem manual mais pesada, mas evita perder literatura conceitual sem menção a desfecho específico.</w:t>
+      </w:r>
+    </w:p>
+    <w:p>
+      <w:pPr>
+        <w:pStyle w:val="Heading3"/>
+        <w:spacing w:after="100" w:before="200"/>
+      </w:pPr>
+      <w:r>
+        <w:t xml:space="preserve">Resultados da execução real no Ovid</w:t>
+      </w:r>
+    </w:p>
+    <w:p>
+      <w:pPr>
+        <w:pBdr>
+          <w:top w:val="single" w:color="CCCCCC" w:sz="4"/>
+          <w:bottom w:val="single" w:color="CCCCCC" w:sz="4"/>
+          <w:left w:val="single" w:color="CCCCCC" w:sz="4"/>
+          <w:right w:val="single" w:color="CCCCCC" w:sz="4"/>
+        </w:pBdr>
+        <w:shd w:fill="F2F2F2" w:val="clear"/>
+        <w:spacing w:after="200" w:before="100"/>
+        <w:ind w:left="200" w:right="200"/>
+      </w:pPr>
+      <w:r>
+        <w:rPr>
+          <w:rFonts w:ascii="Courier New" w:cs="Courier New" w:eastAsia="Courier New" w:hAnsi="Courier New"/>
+          <w:sz w:val="20"/>
+          <w:szCs w:val="20"/>
+        </w:rPr>
+        <w:t xml:space="preserve">17. exp Socioeconomic Factors/                                          555330</w:t>
+      </w:r>
+      <w:r>
+        <w:br/>
+      </w:r>
+      <w:r>
+        <w:rPr>
+          <w:rFonts w:ascii="Courier New" w:cs="Courier New" w:eastAsia="Courier New" w:hAnsi="Courier New"/>
+          <w:sz w:val="20"/>
+          <w:szCs w:val="20"/>
+        </w:rPr>
+        <w:t xml:space="preserve">20. or/15-19                                                            594816</w:t>
+      </w:r>
+      <w:r>
+        <w:br/>
+      </w:r>
+      <w:r>
+        <w:rPr>
+          <w:rFonts w:ascii="Courier New" w:cs="Courier New" w:eastAsia="Courier New" w:hAnsi="Courier New"/>
+          <w:sz w:val="20"/>
+          <w:szCs w:val="20"/>
+        </w:rPr>
+        <w:t xml:space="preserve">21. exp Social Mobility/                                                  1242</w:t>
+      </w:r>
+      <w:r>
+        <w:br/>
+      </w:r>
+      <w:r>
+        <w:rPr>
+          <w:rFonts w:ascii="Courier New" w:cs="Courier New" w:eastAsia="Courier New" w:hAnsi="Courier New"/>
+          <w:sz w:val="20"/>
+          <w:szCs w:val="20"/>
+        </w:rPr>
+        <w:t xml:space="preserve">23. 21 or 22                                                              3728</w:t>
+      </w:r>
+      <w:r>
+        <w:br/>
+      </w:r>
+      <w:r>
+        <w:rPr>
+          <w:rFonts w:ascii="Courier New" w:cs="Courier New" w:eastAsia="Courier New" w:hAnsi="Courier New"/>
+          <w:sz w:val="20"/>
+          <w:szCs w:val="20"/>
+        </w:rPr>
+        <w:t xml:space="preserve">24. 6 or 20 or 23                                                       608812</w:t>
+      </w:r>
+      <w:r>
+        <w:br/>
+      </w:r>
+      <w:r>
+        <w:rPr>
+          <w:rFonts w:ascii="Courier New" w:cs="Courier New" w:eastAsia="Courier New" w:hAnsi="Courier New"/>
+          <w:sz w:val="20"/>
+          <w:szCs w:val="20"/>
+        </w:rPr>
+        <w:t xml:space="preserve">25. limit 24 to yr="1990-Current"                                      511959</w:t>
+      </w:r>
+    </w:p>
+    <w:p>
+      <w:pPr>
+        <w:spacing w:after="150"/>
+      </w:pPr>
+      <w:r>
+        <w:rPr>
+          <w:b/>
+          <w:bCs/>
+          <w:sz w:val="20"/>
+          <w:szCs w:val="20"/>
+        </w:rPr>
+        <w:t xml:space="preserve">Decisão: Estratégia B descartada — 511.959 resultados confirmam o alerta da bibliotecária (linha dominada pelo MeSH genérico Socioeconomic Factors/, inviável para triagem manual). A categoria "Theoretical Basis/Framework/Perspective" fica sem cobertura dedicada nesta rodada.</w:t>
+      </w:r>
+    </w:p>
+    <w:p>
+      <w:pPr>
+        <w:pStyle w:val="Heading2"/>
+        <w:spacing w:after="150" w:before="300"/>
+      </w:pPr>
+      <w:r>
+        <w:t xml:space="preserve">1.5 Checklist de processo</w:t>
+      </w:r>
+    </w:p>
+    <w:p>
+      <w:pPr>
+        <w:pStyle w:val="ListParagraph"/>
+        <w:numPr>
+          <w:ilvl w:val="0"/>
+          <w:numId w:val="1"/>
+        </w:numPr>
+        <w:spacing w:after="80"/>
+      </w:pPr>
+      <w:r>
+        <w:t xml:space="preserve">Rodar nas 3 bases combinadas via Ovid (Medline + Embase + PsycINFO).</w:t>
+      </w:r>
+    </w:p>
+    <w:p>
+      <w:pPr>
+        <w:pStyle w:val="ListParagraph"/>
+        <w:numPr>
+          <w:ilvl w:val="0"/>
+          <w:numId w:val="1"/>
+        </w:numPr>
+        <w:spacing w:after="80"/>
+      </w:pPr>
+      <w:r>
+        <w:t xml:space="preserve">Aplicar Remove Duplicates antes de exportar.</w:t>
+      </w:r>
+    </w:p>
+    <w:p>
+      <w:pPr>
+        <w:pStyle w:val="ListParagraph"/>
+        <w:numPr>
+          <w:ilvl w:val="0"/>
+          <w:numId w:val="1"/>
+        </w:numPr>
+        <w:spacing w:after="80"/>
+      </w:pPr>
+      <w:r>
+        <w:t xml:space="preserve">Exportar Estratégia A e B separadamente, já rotulando por categoria (facilita a triagem com Downs &amp; Black depois).</w:t>
+      </w:r>
+    </w:p>
+    <w:p>
+      <w:pPr>
+        <w:pStyle w:val="ListParagraph"/>
+        <w:numPr>
+          <w:ilvl w:val="0"/>
+          <w:numId w:val="1"/>
+        </w:numPr>
+        <w:spacing w:after="80"/>
+      </w:pPr>
+      <w:r>
+        <w:t xml:space="preserve">Configurar Auto-Alert para ambas as estratégias.</w:t>
+      </w:r>
+    </w:p>
+    <w:p>
+      <w:pPr>
+        <w:pStyle w:val="Heading1"/>
+        <w:spacing w:after="200" w:before="400"/>
+      </w:pPr>
+      <w:r>
+        <w:t xml:space="preserve">2. Estratégia de Busca — Fundamental Causes</w:t>
+      </w:r>
+    </w:p>
+    <w:p>
+      <w:pPr>
+        <w:pStyle w:val="Heading2"/>
+        <w:spacing w:after="150" w:before="300"/>
+      </w:pPr>
+      <w:r>
+        <w:t xml:space="preserve">2.1 Conceitos-chave (nota da epidemiologista social)</w:t>
+      </w:r>
+    </w:p>
+    <w:p>
+      <w:pPr>
+        <w:spacing w:after="150"/>
+      </w:pPr>
+      <w:r>
+        <w:t xml:space="preserve">A teoria de Link &amp; Phelan (1995) não é sinônimo de "SES causa saúde" genérico. O que a diferencia: (1) recursos flexíveis — dinheiro, conhecimento, poder, prestígio, conexões sociais; (2) a associação persiste através de múltiplos mecanismos e múltiplas doenças; (3) a associação se reproduz quando surgem novos meios de evitar risco ("innovação"), frequentemente ampliando desigualdades em vez de reduzi-las.</w:t>
+      </w:r>
+    </w:p>
+    <w:p>
+      <w:pPr>
+        <w:pStyle w:val="ListParagraph"/>
+        <w:numPr>
+          <w:ilvl w:val="0"/>
+          <w:numId w:val="1"/>
+        </w:numPr>
+        <w:spacing w:after="80"/>
+      </w:pPr>
+      <w:r>
+        <w:t xml:space="preserve">Termos centrais: fundamental cause(s), flexible resources, beneficial social connections.</w:t>
+      </w:r>
+    </w:p>
+    <w:p>
+      <w:pPr>
+        <w:pStyle w:val="ListParagraph"/>
+        <w:numPr>
+          <w:ilvl w:val="0"/>
+          <w:numId w:val="1"/>
+        </w:numPr>
+        <w:spacing w:after="80"/>
+      </w:pPr>
+      <w:r>
+        <w:t xml:space="preserve">Elementos de teste empírico da teoria: diffusion of innovation, know-your-risk, disparidades que aumentam com novas tecnologias/intervenções.</w:t>
+      </w:r>
+    </w:p>
+    <w:p>
+      <w:pPr>
+        <w:pStyle w:val="Heading2"/>
+        <w:spacing w:after="150" w:before="300"/>
+      </w:pPr>
+      <w:r>
+        <w:t xml:space="preserve">2.2 Comentários da bibliotecária (sintaxe Ovid)</w:t>
+      </w:r>
+    </w:p>
+    <w:p>
+      <w:pPr>
+        <w:pStyle w:val="ListParagraph"/>
+        <w:numPr>
+          <w:ilvl w:val="0"/>
+          <w:numId w:val="1"/>
+        </w:numPr>
+        <w:spacing w:after="80"/>
+      </w:pPr>
+      <w:r>
+        <w:t xml:space="preserve">Remover o cruzamento direto com exp Socioeconomic Factors/ — sozinho, esse MeSH cruzado com desfecho de saúde é redundante com a Estratégia B de Social Causation/Health Selection, gerando duplicação massiva de resultados já triados.</w:t>
+      </w:r>
+    </w:p>
+    <w:p>
+      <w:pPr>
+        <w:pStyle w:val="ListParagraph"/>
+        <w:numPr>
+          <w:ilvl w:val="0"/>
+          <w:numId w:val="1"/>
+        </w:numPr>
+        <w:spacing w:after="80"/>
+      </w:pPr>
+      <w:r>
+        <w:t xml:space="preserve">"Fundamental causes" é um conceito rastreável a um artigo seminal (Link &amp; Phelan, 1995) e sua revisão de 2010 (Phelan, Link &amp; Tehranifar) — ideal para busca por citação (cited reference search), que o Ovid não faz bem.</w:t>
+      </w:r>
+    </w:p>
+    <w:p>
+      <w:pPr>
+        <w:pStyle w:val="ListParagraph"/>
+        <w:numPr>
+          <w:ilvl w:val="0"/>
+          <w:numId w:val="1"/>
+        </w:numPr>
+        <w:spacing w:after="80"/>
+      </w:pPr>
+      <w:r>
+        <w:t xml:space="preserve">Complementar fora do Ovid: rodar "cited by" no Web of Science ou Google Scholar para os dois artigos-âncora, e cruzar manualmente com os resultados do Ovid.</w:t>
+      </w:r>
+    </w:p>
+    <w:p>
+      <w:pPr>
+        <w:pStyle w:val="ListParagraph"/>
+        <w:numPr>
+          <w:ilvl w:val="0"/>
+          <w:numId w:val="1"/>
+        </w:numPr>
+        <w:spacing w:after="80"/>
+      </w:pPr>
+      <w:r>
+        <w:t xml:space="preserve">Usar aspas para frases compostas exatas (ex.: "beneficial social connections") para evitar ruído de adjacência solta.</w:t>
+      </w:r>
+    </w:p>
+    <w:p>
+      <w:pPr>
+        <w:pStyle w:val="ListParagraph"/>
+        <w:numPr>
+          <w:ilvl w:val="0"/>
+          <w:numId w:val="1"/>
+        </w:numPr>
+        <w:spacing w:after="80"/>
+      </w:pPr>
+      <w:r>
+        <w:t xml:space="preserve">Sem limite de idioma, mantendo consistência com a estratégia anterior.</w:t>
+      </w:r>
+    </w:p>
+    <w:p>
+      <w:pPr>
+        <w:pStyle w:val="Heading2"/>
+        <w:spacing w:after="150" w:before="300"/>
+      </w:pPr>
+      <w:r>
+        <w:t xml:space="preserve">2.3 Estratégia revisada (Ovid)</w:t>
+      </w:r>
+    </w:p>
+    <w:p>
+      <w:pPr>
+        <w:pBdr>
+          <w:top w:val="single" w:color="CCCCCC" w:sz="4"/>
+          <w:bottom w:val="single" w:color="CCCCCC" w:sz="4"/>
+          <w:left w:val="single" w:color="CCCCCC" w:sz="4"/>
+          <w:right w:val="single" w:color="CCCCCC" w:sz="4"/>
+        </w:pBdr>
+        <w:shd w:fill="F2F2F2" w:val="clear"/>
+        <w:spacing w:after="200" w:before="100"/>
+        <w:ind w:left="200" w:right="200"/>
+      </w:pPr>
+      <w:r>
+        <w:rPr>
+          <w:rFonts w:ascii="Courier New" w:cs="Courier New" w:eastAsia="Courier New" w:hAnsi="Courier New"/>
+          <w:sz w:val="20"/>
+          <w:szCs w:val="20"/>
+        </w:rPr>
         <w:t xml:space="preserve">1. fundamental cause*.mp,ti,ab.</w:t>
       </w:r>
       <w:r>
@@ -917,6 +1203,237 @@
           <w:szCs w:val="20"/>
         </w:rPr>
         <w:t xml:space="preserve">16. limit 15 to yr="1990-Current"</w:t>
+      </w:r>
+    </w:p>
+    <w:p>
+      <w:pPr>
+        <w:pStyle w:val="Heading3"/>
+        <w:spacing w:after="100" w:before="200"/>
+      </w:pPr>
+      <w:r>
+        <w:t xml:space="preserve">Resultados da execução real no Ovid</w:t>
+      </w:r>
+    </w:p>
+    <w:p>
+      <w:pPr>
+        <w:pBdr>
+          <w:top w:val="single" w:color="CCCCCC" w:sz="4"/>
+          <w:bottom w:val="single" w:color="CCCCCC" w:sz="4"/>
+          <w:left w:val="single" w:color="CCCCCC" w:sz="4"/>
+          <w:right w:val="single" w:color="CCCCCC" w:sz="4"/>
+        </w:pBdr>
+        <w:shd w:fill="F2F2F2" w:val="clear"/>
+        <w:spacing w:after="200" w:before="100"/>
+        <w:ind w:left="200" w:right="200"/>
+      </w:pPr>
+      <w:r>
+        <w:rPr>
+          <w:rFonts w:ascii="Courier New" w:cs="Courier New" w:eastAsia="Courier New" w:hAnsi="Courier New"/>
+          <w:sz w:val="20"/>
+          <w:szCs w:val="20"/>
+        </w:rPr>
+        <w:t xml:space="preserve">1.  fundamental cause*.mp,ti,ab.                                           1140</w:t>
+      </w:r>
+      <w:r>
+        <w:br/>
+      </w:r>
+      <w:r>
+        <w:rPr>
+          <w:rFonts w:ascii="Courier New" w:cs="Courier New" w:eastAsia="Courier New" w:hAnsi="Courier New"/>
+          <w:sz w:val="20"/>
+          <w:szCs w:val="20"/>
+        </w:rPr>
+        <w:t xml:space="preserve">2.  (fundamental adj3 (cause* or perspective or theory)).mp,ti,ab.         2850</w:t>
+      </w:r>
+      <w:r>
+        <w:br/>
+      </w:r>
+      <w:r>
+        <w:rPr>
+          <w:rFonts w:ascii="Courier New" w:cs="Courier New" w:eastAsia="Courier New" w:hAnsi="Courier New"/>
+          <w:sz w:val="20"/>
+          <w:szCs w:val="20"/>
+        </w:rPr>
+        <w:t xml:space="preserve">3.  flexible resource*.mp,ti,ab.                                            150</w:t>
+      </w:r>
+      <w:r>
+        <w:br/>
+      </w:r>
+      <w:r>
+        <w:rPr>
+          <w:rFonts w:ascii="Courier New" w:cs="Courier New" w:eastAsia="Courier New" w:hAnsi="Courier New"/>
+          <w:sz w:val="20"/>
+          <w:szCs w:val="20"/>
+        </w:rPr>
+        <w:t xml:space="preserve">4.  "beneficial social connections".mp,ti,ab.                                14</w:t>
+      </w:r>
+      <w:r>
+        <w:br/>
+      </w:r>
+      <w:r>
+        <w:rPr>
+          <w:rFonts w:ascii="Courier New" w:cs="Courier New" w:eastAsia="Courier New" w:hAnsi="Courier New"/>
+          <w:sz w:val="20"/>
+          <w:szCs w:val="20"/>
+        </w:rPr>
+        <w:t xml:space="preserve">5.  or/1-4                                                                 2996</w:t>
+      </w:r>
+      <w:r>
+        <w:br/>
+      </w:r>
+      <w:r>
+        <w:rPr>
+          <w:rFonts w:ascii="Courier New" w:cs="Courier New" w:eastAsia="Courier New" w:hAnsi="Courier New"/>
+          <w:sz w:val="20"/>
+          <w:szCs w:val="20"/>
+        </w:rPr>
+        <w:t xml:space="preserve">6.  ((money or knowledge or power or prestige) adj5 resource*).mp,ti,ab.   9550</w:t>
+      </w:r>
+      <w:r>
+        <w:br/>
+      </w:r>
+      <w:r>
+        <w:rPr>
+          <w:rFonts w:ascii="Courier New" w:cs="Courier New" w:eastAsia="Courier New" w:hAnsi="Courier New"/>
+          <w:sz w:val="20"/>
+          <w:szCs w:val="20"/>
+        </w:rPr>
+        <w:t xml:space="preserve">7.  5 or 6                                                                12520</w:t>
+      </w:r>
+      <w:r>
+        <w:br/>
+      </w:r>
+      <w:r>
+        <w:rPr>
+          <w:rFonts w:ascii="Courier New" w:cs="Courier New" w:eastAsia="Courier New" w:hAnsi="Courier New"/>
+          <w:sz w:val="20"/>
+          <w:szCs w:val="20"/>
+        </w:rPr>
+        <w:t xml:space="preserve">8.  (diffusion adj3 innovation*).mp,ti,ab.                                20016</w:t>
+      </w:r>
+      <w:r>
+        <w:br/>
+      </w:r>
+      <w:r>
+        <w:rPr>
+          <w:rFonts w:ascii="Courier New" w:cs="Courier New" w:eastAsia="Courier New" w:hAnsi="Courier New"/>
+          <w:sz w:val="20"/>
+          <w:szCs w:val="20"/>
+        </w:rPr>
+        <w:t xml:space="preserve">9.  "know-your-risk".mp,ti,ab.                                              12</w:t>
+      </w:r>
+      <w:r>
+        <w:br/>
+      </w:r>
+      <w:r>
+        <w:rPr>
+          <w:rFonts w:ascii="Courier New" w:cs="Courier New" w:eastAsia="Courier New" w:hAnsi="Courier New"/>
+          <w:sz w:val="20"/>
+          <w:szCs w:val="20"/>
+        </w:rPr>
+        <w:t xml:space="preserve">10. (new adj3 (technology or intervention or treatment)) adj5</w:t>
+      </w:r>
+      <w:r>
+        <w:br/>
+      </w:r>
+      <w:r>
+        <w:rPr>
+          <w:rFonts w:ascii="Courier New" w:cs="Courier New" w:eastAsia="Courier New" w:hAnsi="Courier New"/>
+          <w:sz w:val="20"/>
+          <w:szCs w:val="20"/>
+        </w:rPr>
+        <w:t xml:space="preserve">    (disparit* or inequalit*).mp,ti,ab.                                     21</w:t>
+      </w:r>
+      <w:r>
+        <w:br/>
+      </w:r>
+      <w:r>
+        <w:rPr>
+          <w:rFonts w:ascii="Courier New" w:cs="Courier New" w:eastAsia="Courier New" w:hAnsi="Courier New"/>
+          <w:sz w:val="20"/>
+          <w:szCs w:val="20"/>
+        </w:rPr>
+        <w:t xml:space="preserve">11. ((widening or increasing) adj3 (disparit* or inequalit* or gap*))</w:t>
+      </w:r>
+      <w:r>
+        <w:br/>
+      </w:r>
+      <w:r>
+        <w:rPr>
+          <w:rFonts w:ascii="Courier New" w:cs="Courier New" w:eastAsia="Courier New" w:hAnsi="Courier New"/>
+          <w:sz w:val="20"/>
+          <w:szCs w:val="20"/>
+        </w:rPr>
+        <w:t xml:space="preserve">    .mp,ti,ab.                                                            5541</w:t>
+      </w:r>
+      <w:r>
+        <w:br/>
+      </w:r>
+      <w:r>
+        <w:rPr>
+          <w:rFonts w:ascii="Courier New" w:cs="Courier New" w:eastAsia="Courier New" w:hAnsi="Courier New"/>
+          <w:sz w:val="20"/>
+          <w:szCs w:val="20"/>
+        </w:rPr>
+        <w:t xml:space="preserve">12. or/8-11                                                               25574</w:t>
+      </w:r>
+      <w:r>
+        <w:br/>
+      </w:r>
+      <w:r>
+        <w:rPr>
+          <w:rFonts w:ascii="Courier New" w:cs="Courier New" w:eastAsia="Courier New" w:hAnsi="Courier New"/>
+          <w:sz w:val="20"/>
+          <w:szCs w:val="20"/>
+        </w:rPr>
+        <w:t xml:space="preserve">13. exp Health Status Disparities/                                        23976</w:t>
+      </w:r>
+      <w:r>
+        <w:br/>
+      </w:r>
+      <w:r>
+        <w:rPr>
+          <w:rFonts w:ascii="Courier New" w:cs="Courier New" w:eastAsia="Courier New" w:hAnsi="Courier New"/>
+          <w:sz w:val="20"/>
+          <w:szCs w:val="20"/>
+        </w:rPr>
+        <w:t xml:space="preserve">14. exp Morbidity/ or exp Mortality/                                    1151482</w:t>
+      </w:r>
+      <w:r>
+        <w:br/>
+      </w:r>
+      <w:r>
+        <w:rPr>
+          <w:rFonts w:ascii="Courier New" w:cs="Courier New" w:eastAsia="Courier New" w:hAnsi="Courier New"/>
+          <w:sz w:val="20"/>
+          <w:szCs w:val="20"/>
+        </w:rPr>
+        <w:t xml:space="preserve">15. 7 and (12 or 13 or 14)                                                  496</w:t>
+      </w:r>
+      <w:r>
+        <w:br/>
+      </w:r>
+      <w:r>
+        <w:rPr>
+          <w:rFonts w:ascii="Courier New" w:cs="Courier New" w:eastAsia="Courier New" w:hAnsi="Courier New"/>
+          <w:sz w:val="20"/>
+          <w:szCs w:val="20"/>
+        </w:rPr>
+        <w:t xml:space="preserve">16. limit 15 to yr="1990-Current"                                         488</w:t>
+      </w:r>
+    </w:p>
+    <w:p>
+      <w:pPr>
+        <w:spacing w:after="150"/>
+      </w:pPr>
+      <w:r>
+        <w:rPr>
+          <w:b/>
+          <w:bCs/>
+          <w:sz w:val="20"/>
+          <w:szCs w:val="20"/>
+        </w:rPr>
+        <w:t xml:space="preserve">Decisão: mantidos os 488 resultados da linha 16 como conjunto final de Fundamental Causes.</w:t>
       </w:r>
     </w:p>
     <w:p>

</xml_diff>